<commit_message>
Approve style guide v1.0; add combat GDD v0.1 and shared docs lib
</commit_message>
<xml_diff>
--- a/docs/Guia_de_Estilo.docx
+++ b/docs/Guia_de_Estilo.docx
@@ -204,7 +204,7 @@
                 <w:sz w:val="19"/>
                 <w:szCs w:val="19"/>
               </w:rPr>
-              <w:t xml:space="preserve">0.1 — proposta para aprovação</w:t>
+              <w:t xml:space="preserve">1.0 — aprovado pelo Diretor (24/09/2026)</w:t>
             </w:r>
           </w:p>
         </w:tc>
@@ -4324,7 +4324,7 @@
         <w:pStyle w:val="Heading2"/>
       </w:pPr>
       <w:r>
-        <w:t xml:space="preserve">Pontos para aprovação</w:t>
+        <w:t xml:space="preserve">Aprovação</w:t>
       </w:r>
     </w:p>
     <w:p>
@@ -4337,33 +4337,14 @@
         <w:spacing w:after="60"/>
       </w:pPr>
       <w:r>
-        <w:t xml:space="preserve">Paleta: as rampas cobrem bem pele, linho, latão, couro, azul imperial e natureza?</w:t>
-      </w:r>
-    </w:p>
-    <w:p>
-      <w:pPr>
-        <w:pStyle w:val="ListParagraph"/>
-        <w:numPr>
-          <w:ilvl w:val="0"/>
-          <w:numId w:val="2"/>
-        </w:numPr>
-        <w:spacing w:after="60"/>
-      </w:pPr>
-      <w:r>
-        <w:t xml:space="preserve">Escala: o Kael com ~56 px de altura (15% da tela de 640×360, proporção parecida com Chrono Trigger) está bom?</w:t>
-      </w:r>
-    </w:p>
-    <w:p>
-      <w:pPr>
-        <w:pStyle w:val="ListParagraph"/>
-        <w:numPr>
-          <w:ilvl w:val="0"/>
-          <w:numId w:val="2"/>
-        </w:numPr>
-        <w:spacing w:after="60"/>
-      </w:pPr>
-      <w:r>
-        <w:t xml:space="preserve">Visual: cabelo azul, cachecol vermelho, óculos de latão e lâmina-engrenagem representam o personagem?</w:t>
+        <w:rPr>
+          <w:b/>
+          <w:bCs/>
+        </w:rPr>
+        <w:t xml:space="preserve">Aprovado em 24/09/2026:</w:t>
+      </w:r>
+      <w:r>
+        <w:t xml:space="preserve"> paleta Velmora 32, escala de ~56 px (célula 64×64) e visual do Kael.</w:t>
       </w:r>
     </w:p>
     <w:sectPr>

</xml_diff>

<commit_message>
Eco and Lyra official references; party preview scene; Suno MCP and Codex MCP bridge recorded
</commit_message>
<xml_diff>
--- a/docs/Guia_de_Estilo.docx
+++ b/docs/Guia_de_Estilo.docx
@@ -4290,7 +4290,364 @@
         <w:pStyle w:val="Heading2"/>
       </w:pPr>
       <w:r>
+        <w:t xml:space="preserve">Referência oficial: Eco</w:t>
+      </w:r>
+    </w:p>
+    <w:p>
+      <w:pPr>
+        <w:keepNext/>
+        <w:spacing w:after="120"/>
+      </w:pPr>
+      <w:r>
+        <w:t xml:space="preserve">Eco, autômato antigo — gerado pela ponte MCP do Codex. Mesmo prompt-base e mesma conversão do Kael.</w:t>
+      </w:r>
+    </w:p>
+    <w:p>
+      <w:pPr>
+        <w:keepNext/>
+        <w:jc w:val="center"/>
+      </w:pPr>
+      <w:r>
+        <w:drawing>
+          <wp:inline distT="0" distB="0" distL="0" distR="0">
+            <wp:extent cx="5715000" cy="2009775"/>
+            <wp:effectExtent t="0" r="0" b="0" l="0"/>
+            <wp:docPr id="1" name="" descr="" title=""/>
+            <wp:cNvGraphicFramePr>
+              <a:graphicFrameLocks xmlns:a="http://schemas.openxmlformats.org/drawingml/2006/main" noChangeAspect="1"/>
+            </wp:cNvGraphicFramePr>
+            <a:graphic xmlns:a="http://schemas.openxmlformats.org/drawingml/2006/main">
+              <a:graphicData uri="http://schemas.openxmlformats.org/drawingml/2006/picture">
+                <pic:pic xmlns:pic="http://schemas.openxmlformats.org/drawingml/2006/picture">
+                  <pic:nvPicPr>
+                    <pic:cNvPr id="0" name="" descr=""/>
+                    <pic:cNvPicPr>
+                      <a:picLocks noChangeAspect="1" noChangeArrowheads="1"/>
+                    </pic:cNvPicPr>
+                  </pic:nvPicPr>
+                  <pic:blipFill>
+                    <a:blip r:embed="rId12" cstate="none"/>
+                    <a:srcRect/>
+                    <a:stretch>
+                      <a:fillRect/>
+                    </a:stretch>
+                  </pic:blipFill>
+                  <pic:spPr bwMode="auto">
+                    <a:xfrm>
+                      <a:off x="0" y="0"/>
+                      <a:ext cx="5715000" cy="2009775"/>
+                    </a:xfrm>
+                    <a:prstGeom prst="rect">
+                      <a:avLst/>
+                    </a:prstGeom>
+                  </pic:spPr>
+                </pic:pic>
+              </a:graphicData>
+            </a:graphic>
+          </wp:inline>
+        </w:drawing>
+      </w:r>
+    </w:p>
+    <w:p>
+      <w:pPr>
+        <w:spacing w:after="200"/>
+        <w:jc w:val="center"/>
+      </w:pPr>
+      <w:r>
+        <w:rPr>
+          <w:i/>
+          <w:iCs/>
+          <w:color w:val="666666"/>
+          <w:sz w:val="18"/>
+          <w:szCs w:val="18"/>
+        </w:rPr>
+        <w:t xml:space="preserve">Eco — imagem bruta</w:t>
+      </w:r>
+    </w:p>
+    <w:p>
+      <w:pPr>
+        <w:keepNext/>
+        <w:jc w:val="center"/>
+      </w:pPr>
+      <w:r>
+        <w:drawing>
+          <wp:inline distT="0" distB="0" distL="0" distR="0">
+            <wp:extent cx="5715000" cy="1428750"/>
+            <wp:effectExtent t="0" r="0" b="0" l="0"/>
+            <wp:docPr id="1" name="" descr="" title=""/>
+            <wp:cNvGraphicFramePr>
+              <a:graphicFrameLocks xmlns:a="http://schemas.openxmlformats.org/drawingml/2006/main" noChangeAspect="1"/>
+            </wp:cNvGraphicFramePr>
+            <a:graphic xmlns:a="http://schemas.openxmlformats.org/drawingml/2006/main">
+              <a:graphicData uri="http://schemas.openxmlformats.org/drawingml/2006/picture">
+                <pic:pic xmlns:pic="http://schemas.openxmlformats.org/drawingml/2006/picture">
+                  <pic:nvPicPr>
+                    <pic:cNvPr id="0" name="" descr=""/>
+                    <pic:cNvPicPr>
+                      <a:picLocks noChangeAspect="1" noChangeArrowheads="1"/>
+                    </pic:cNvPicPr>
+                  </pic:nvPicPr>
+                  <pic:blipFill>
+                    <a:blip r:embed="rId13" cstate="none"/>
+                    <a:srcRect/>
+                    <a:stretch>
+                      <a:fillRect/>
+                    </a:stretch>
+                  </pic:blipFill>
+                  <pic:spPr bwMode="auto">
+                    <a:xfrm>
+                      <a:off x="0" y="0"/>
+                      <a:ext cx="5715000" cy="1428750"/>
+                    </a:xfrm>
+                    <a:prstGeom prst="rect">
+                      <a:avLst/>
+                    </a:prstGeom>
+                  </pic:spPr>
+                </pic:pic>
+              </a:graphicData>
+            </a:graphic>
+          </wp:inline>
+        </w:drawing>
+      </w:r>
+    </w:p>
+    <w:p>
+      <w:pPr>
+        <w:spacing w:after="200"/>
+        <w:jc w:val="center"/>
+      </w:pPr>
+      <w:r>
+        <w:rPr>
+          <w:i/>
+          <w:iCs/>
+          <w:color w:val="666666"/>
+          <w:sz w:val="18"/>
+          <w:szCs w:val="18"/>
+        </w:rPr>
+        <w:t xml:space="preserve">Eco — após a conversão (prévia ampliada 6×)</w:t>
+      </w:r>
+    </w:p>
+    <w:p>
+      <w:pPr>
+        <w:pStyle w:val="Heading2"/>
+      </w:pPr>
+      <w:r>
+        <w:t xml:space="preserve">Referência oficial: Lyra</w:t>
+      </w:r>
+    </w:p>
+    <w:p>
+      <w:pPr>
+        <w:keepNext/>
+        <w:spacing w:after="120"/>
+      </w:pPr>
+      <w:r>
+        <w:t xml:space="preserve">Lyra, druida de Sylvaran — gerada pelo gen_image.ps1. Mesmo prompt-base e mesma conversão do Kael.</w:t>
+      </w:r>
+    </w:p>
+    <w:p>
+      <w:pPr>
+        <w:keepNext/>
+        <w:jc w:val="center"/>
+      </w:pPr>
+      <w:r>
+        <w:drawing>
+          <wp:inline distT="0" distB="0" distL="0" distR="0">
+            <wp:extent cx="5715000" cy="2028825"/>
+            <wp:effectExtent t="0" r="0" b="0" l="0"/>
+            <wp:docPr id="1" name="" descr="" title=""/>
+            <wp:cNvGraphicFramePr>
+              <a:graphicFrameLocks xmlns:a="http://schemas.openxmlformats.org/drawingml/2006/main" noChangeAspect="1"/>
+            </wp:cNvGraphicFramePr>
+            <a:graphic xmlns:a="http://schemas.openxmlformats.org/drawingml/2006/main">
+              <a:graphicData uri="http://schemas.openxmlformats.org/drawingml/2006/picture">
+                <pic:pic xmlns:pic="http://schemas.openxmlformats.org/drawingml/2006/picture">
+                  <pic:nvPicPr>
+                    <pic:cNvPr id="0" name="" descr=""/>
+                    <pic:cNvPicPr>
+                      <a:picLocks noChangeAspect="1" noChangeArrowheads="1"/>
+                    </pic:cNvPicPr>
+                  </pic:nvPicPr>
+                  <pic:blipFill>
+                    <a:blip r:embed="rId14" cstate="none"/>
+                    <a:srcRect/>
+                    <a:stretch>
+                      <a:fillRect/>
+                    </a:stretch>
+                  </pic:blipFill>
+                  <pic:spPr bwMode="auto">
+                    <a:xfrm>
+                      <a:off x="0" y="0"/>
+                      <a:ext cx="5715000" cy="2028825"/>
+                    </a:xfrm>
+                    <a:prstGeom prst="rect">
+                      <a:avLst/>
+                    </a:prstGeom>
+                  </pic:spPr>
+                </pic:pic>
+              </a:graphicData>
+            </a:graphic>
+          </wp:inline>
+        </w:drawing>
+      </w:r>
+    </w:p>
+    <w:p>
+      <w:pPr>
+        <w:spacing w:after="200"/>
+        <w:jc w:val="center"/>
+      </w:pPr>
+      <w:r>
+        <w:rPr>
+          <w:i/>
+          <w:iCs/>
+          <w:color w:val="666666"/>
+          <w:sz w:val="18"/>
+          <w:szCs w:val="18"/>
+        </w:rPr>
+        <w:t xml:space="preserve">Lyra — imagem bruta</w:t>
+      </w:r>
+    </w:p>
+    <w:p>
+      <w:pPr>
+        <w:keepNext/>
+        <w:jc w:val="center"/>
+      </w:pPr>
+      <w:r>
+        <w:drawing>
+          <wp:inline distT="0" distB="0" distL="0" distR="0">
+            <wp:extent cx="5715000" cy="1428750"/>
+            <wp:effectExtent t="0" r="0" b="0" l="0"/>
+            <wp:docPr id="1" name="" descr="" title=""/>
+            <wp:cNvGraphicFramePr>
+              <a:graphicFrameLocks xmlns:a="http://schemas.openxmlformats.org/drawingml/2006/main" noChangeAspect="1"/>
+            </wp:cNvGraphicFramePr>
+            <a:graphic xmlns:a="http://schemas.openxmlformats.org/drawingml/2006/main">
+              <a:graphicData uri="http://schemas.openxmlformats.org/drawingml/2006/picture">
+                <pic:pic xmlns:pic="http://schemas.openxmlformats.org/drawingml/2006/picture">
+                  <pic:nvPicPr>
+                    <pic:cNvPr id="0" name="" descr=""/>
+                    <pic:cNvPicPr>
+                      <a:picLocks noChangeAspect="1" noChangeArrowheads="1"/>
+                    </pic:cNvPicPr>
+                  </pic:nvPicPr>
+                  <pic:blipFill>
+                    <a:blip r:embed="rId15" cstate="none"/>
+                    <a:srcRect/>
+                    <a:stretch>
+                      <a:fillRect/>
+                    </a:stretch>
+                  </pic:blipFill>
+                  <pic:spPr bwMode="auto">
+                    <a:xfrm>
+                      <a:off x="0" y="0"/>
+                      <a:ext cx="5715000" cy="1428750"/>
+                    </a:xfrm>
+                    <a:prstGeom prst="rect">
+                      <a:avLst/>
+                    </a:prstGeom>
+                  </pic:spPr>
+                </pic:pic>
+              </a:graphicData>
+            </a:graphic>
+          </wp:inline>
+        </w:drawing>
+      </w:r>
+    </w:p>
+    <w:p>
+      <w:pPr>
+        <w:spacing w:after="200"/>
+        <w:jc w:val="center"/>
+      </w:pPr>
+      <w:r>
+        <w:rPr>
+          <w:i/>
+          <w:iCs/>
+          <w:color w:val="666666"/>
+          <w:sz w:val="18"/>
+          <w:szCs w:val="18"/>
+        </w:rPr>
+        <w:t xml:space="preserve">Lyra — após a conversão (prévia ampliada 6×)</w:t>
+      </w:r>
+    </w:p>
+    <w:p>
+      <w:pPr>
+        <w:keepNext/>
+        <w:jc w:val="center"/>
+      </w:pPr>
+      <w:r>
+        <w:drawing>
+          <wp:inline distT="0" distB="0" distL="0" distR="0">
+            <wp:extent cx="5715000" cy="3219450"/>
+            <wp:effectExtent t="0" r="0" b="0" l="0"/>
+            <wp:docPr id="1" name="" descr="" title=""/>
+            <wp:cNvGraphicFramePr>
+              <a:graphicFrameLocks xmlns:a="http://schemas.openxmlformats.org/drawingml/2006/main" noChangeAspect="1"/>
+            </wp:cNvGraphicFramePr>
+            <a:graphic xmlns:a="http://schemas.openxmlformats.org/drawingml/2006/main">
+              <a:graphicData uri="http://schemas.openxmlformats.org/drawingml/2006/picture">
+                <pic:pic xmlns:pic="http://schemas.openxmlformats.org/drawingml/2006/picture">
+                  <pic:nvPicPr>
+                    <pic:cNvPr id="0" name="" descr=""/>
+                    <pic:cNvPicPr>
+                      <a:picLocks noChangeAspect="1" noChangeArrowheads="1"/>
+                    </pic:cNvPicPr>
+                  </pic:nvPicPr>
+                  <pic:blipFill>
+                    <a:blip r:embed="rId16" cstate="none"/>
+                    <a:srcRect/>
+                    <a:stretch>
+                      <a:fillRect/>
+                    </a:stretch>
+                  </pic:blipFill>
+                  <pic:spPr bwMode="auto">
+                    <a:xfrm>
+                      <a:off x="0" y="0"/>
+                      <a:ext cx="5715000" cy="3219450"/>
+                    </a:xfrm>
+                    <a:prstGeom prst="rect">
+                      <a:avLst/>
+                    </a:prstGeom>
+                  </pic:spPr>
+                </pic:pic>
+              </a:graphicData>
+            </a:graphic>
+          </wp:inline>
+        </w:drawing>
+      </w:r>
+    </w:p>
+    <w:p>
+      <w:pPr>
+        <w:spacing w:after="200"/>
+        <w:jc w:val="center"/>
+      </w:pPr>
+      <w:r>
+        <w:rPr>
+          <w:i/>
+          <w:iCs/>
+          <w:color w:val="666666"/>
+          <w:sz w:val="18"/>
+          <w:szCs w:val="18"/>
+        </w:rPr>
+        <w:t xml:space="preserve">Os três no Godot (640×360): à esquerda no tamanho real, à direita ampliados 2×</w:t>
+      </w:r>
+    </w:p>
+    <w:p>
+      <w:pPr>
+        <w:pStyle w:val="Heading2"/>
+      </w:pPr>
+      <w:r>
         <w:t xml:space="preserve">Limitações conhecidas</w:t>
+      </w:r>
+    </w:p>
+    <w:p>
+      <w:pPr>
+        <w:pStyle w:val="ListParagraph"/>
+        <w:numPr>
+          <w:ilvl w:val="0"/>
+          <w:numId w:val="2"/>
+        </w:numPr>
+        <w:spacing w:after="60"/>
+      </w:pPr>
+      <w:r>
+        <w:t xml:space="preserve">Pedra clara (Eco) cai na rampa de pele e fica levemente pêssego: se incomodar, trocar uma cor por um bege-pedra neutro.</w:t>
       </w:r>
     </w:p>
     <w:p>

</xml_diff>